<commit_message>
Tharp 1.2.1: estructura interna reorganizada y validación reproducible en cualquier plataforma (tharp@5bf6f51)
</commit_message>
<xml_diff>
--- a/ejemplo/tharp-resultados-ejemplo.docx
+++ b/ejemplo/tharp-resultados-ejemplo.docx
@@ -18,7 +18,7 @@
         <w:rPr>
           <w:color w:val="555555"/>
         </w:rPr>
-        <w:t xml:space="preserve">Generado con Tharp 1.2.0 (tharp.es) el 17/10/2026 a partir de «tharp_datos_ejemplo.csv».</w:t>
+        <w:t xml:space="preserve">Generado con Tharp 1.2.1 (tharp.es) el 19/10/2026 a partir de «tharp_datos_ejemplo.csv».</w:t>
       </w:r>
     </w:p>
     <w:p>
@@ -51941,7 +51941,7 @@
         <w:t xml:space="preserve">En el apartado de análisis de datos:</w:t>
       </w:r>
       <w:r>
-        <w:t xml:space="preserve"> Los análisis estadísticos se realizaron con Tharp (versión 1.2.0; Agüí Ruiz, 2026).</w:t>
+        <w:t xml:space="preserve"> Los análisis estadísticos se realizaron con Tharp (versión 1.2.1; Agüí Ruiz, 2026).</w:t>
       </w:r>
     </w:p>
     <w:p>
@@ -51972,7 +51972,7 @@
         <w:t xml:space="preserve">Tharp</w:t>
       </w:r>
       <w:r>
-        <w:t xml:space="preserve"> (Versión 1.2.0) [Software]. https://tharp.es</w:t>
+        <w:t xml:space="preserve"> (Versión 1.2.1) [Software]. https://tharp.es</w:t>
       </w:r>
     </w:p>
     <w:p>

</xml_diff>

<commit_message>
Tharp 1.2.2: librerías actualizadas, avisos accesibles y accesibilidad comprobada (tharp@6e1d7f1)
</commit_message>
<xml_diff>
--- a/ejemplo/tharp-resultados-ejemplo.docx
+++ b/ejemplo/tharp-resultados-ejemplo.docx
@@ -18,7 +18,7 @@
         <w:rPr>
           <w:color w:val="555555"/>
         </w:rPr>
-        <w:t xml:space="preserve">Generado con Tharp 1.2.1 (tharp.es) el 19/10/2026 a partir de «tharp_datos_ejemplo.csv».</w:t>
+        <w:t xml:space="preserve">Generado con Tharp 1.2.2 (tharp.es) el 19/10/2026 a partir de «tharp_datos_ejemplo.csv».</w:t>
       </w:r>
     </w:p>
     <w:p>
@@ -51941,7 +51941,7 @@
         <w:t xml:space="preserve">En el apartado de análisis de datos:</w:t>
       </w:r>
       <w:r>
-        <w:t xml:space="preserve"> Los análisis estadísticos se realizaron con Tharp (versión 1.2.1; Agüí Ruiz, 2026).</w:t>
+        <w:t xml:space="preserve"> Los análisis estadísticos se realizaron con Tharp (versión 1.2.2; Agüí Ruiz, 2026).</w:t>
       </w:r>
     </w:p>
     <w:p>
@@ -51972,7 +51972,7 @@
         <w:t xml:space="preserve">Tharp</w:t>
       </w:r>
       <w:r>
-        <w:t xml:space="preserve"> (Versión 1.2.1) [Software]. https://tharp.es</w:t>
+        <w:t xml:space="preserve"> (Versión 1.2.2) [Software]. https://tharp.es</w:t>
       </w:r>
     </w:p>
     <w:p>

</xml_diff>